<commit_message>
Atualiza molde Word: 4 fotos funcionais, Operador CCM combinado
</commit_message>
<xml_diff>
--- a/rad/templates_export/rda_oficial_template.docx
+++ b/rad/templates_export/rda_oficial_template.docx
@@ -255,6 +255,7 @@
             <w:pPr>
               <w:spacing w:after="0" w:line="252" w:lineRule="auto"/>
             </w:pPr>
+            <w:proofErr w:type="gramStart"/>
             <w:r>
               <w:rPr>
                 <w:rFonts w:ascii="Arial" w:hAnsi="Arial"/>
@@ -262,6 +263,14 @@
                 <w:sz w:val="17"/>
               </w:rPr>
               <w:t>{{CB_VIA1}} Via 1</w:t>
+            </w:r>
+            <w:proofErr w:type="gramEnd"/>
+            <w:r>
+              <w:rPr>
+                <w:rFonts w:ascii="Arial" w:hAnsi="Arial"/>
+                <w:b/>
+                <w:sz w:val="17"/>
+              </w:rPr>
             </w:r>
           </w:p>
         </w:tc>
@@ -286,6 +295,7 @@
             <w:pPr>
               <w:spacing w:after="0" w:line="252" w:lineRule="auto"/>
             </w:pPr>
+            <w:proofErr w:type="gramStart"/>
             <w:r>
               <w:rPr>
                 <w:rFonts w:ascii="Arial" w:hAnsi="Arial"/>
@@ -301,6 +311,14 @@
                 <w:sz w:val="17"/>
               </w:rPr>
             </w:r>
+            <w:r>
+              <w:rPr>
+                <w:rFonts w:ascii="Arial" w:hAnsi="Arial"/>
+                <w:b/>
+                <w:sz w:val="17"/>
+              </w:rPr>
+            </w:r>
+            <w:proofErr w:type="gramEnd"/>
             <w:r>
               <w:rPr>
                 <w:rFonts w:ascii="Arial" w:hAnsi="Arial"/>
@@ -331,6 +349,7 @@
             <w:pPr>
               <w:spacing w:after="0" w:line="252" w:lineRule="auto"/>
             </w:pPr>
+            <w:proofErr w:type="gramStart"/>
             <w:r>
               <w:rPr>
                 <w:rFonts w:ascii="Arial" w:hAnsi="Arial"/>
@@ -338,6 +357,14 @@
                 <w:sz w:val="17"/>
               </w:rPr>
               <w:t>{{CB_VIA3}} Via 3</w:t>
+            </w:r>
+            <w:proofErr w:type="gramEnd"/>
+            <w:r>
+              <w:rPr>
+                <w:rFonts w:ascii="Arial" w:hAnsi="Arial"/>
+                <w:b/>
+                <w:sz w:val="17"/>
+              </w:rPr>
             </w:r>
           </w:p>
         </w:tc>
@@ -361,6 +388,7 @@
             <w:pPr>
               <w:spacing w:after="0" w:line="252" w:lineRule="auto"/>
             </w:pPr>
+            <w:proofErr w:type="gramStart"/>
             <w:r>
               <w:rPr>
                 <w:rFonts w:ascii="Arial" w:hAnsi="Arial"/>
@@ -368,6 +396,14 @@
                 <w:sz w:val="17"/>
               </w:rPr>
               <w:t>{{CB_VIA4}} Via 4</w:t>
+            </w:r>
+            <w:proofErr w:type="gramEnd"/>
+            <w:r>
+              <w:rPr>
+                <w:rFonts w:ascii="Arial" w:hAnsi="Arial"/>
+                <w:b/>
+                <w:sz w:val="17"/>
+              </w:rPr>
             </w:r>
           </w:p>
         </w:tc>
@@ -436,6 +472,20 @@
               </w:rPr>
               <w:t>{{LOCAL}}</w:t>
             </w:r>
+            <w:proofErr w:type="spellStart"/>
+            <w:r>
+              <w:rPr>
+                <w:rFonts w:ascii="Arial" w:hAnsi="Arial"/>
+                <w:sz w:val="17"/>
+              </w:rPr>
+            </w:r>
+            <w:proofErr w:type="spellEnd"/>
+            <w:r>
+              <w:rPr>
+                <w:rFonts w:ascii="Arial" w:hAnsi="Arial"/>
+                <w:sz w:val="17"/>
+              </w:rPr>
+            </w:r>
           </w:p>
         </w:tc>
         <w:tc>
@@ -489,6 +539,7 @@
             <w:pPr>
               <w:spacing w:after="0" w:line="252" w:lineRule="auto"/>
             </w:pPr>
+            <w:proofErr w:type="gramStart"/>
             <w:r>
               <w:rPr>
                 <w:rFonts w:ascii="Arial" w:hAnsi="Arial"/>
@@ -504,6 +555,30 @@
                 <w:sz w:val="17"/>
               </w:rPr>
             </w:r>
+            <w:r>
+              <w:rPr>
+                <w:rFonts w:ascii="Arial" w:hAnsi="Arial"/>
+                <w:b/>
+                <w:sz w:val="17"/>
+              </w:rPr>
+            </w:r>
+            <w:proofErr w:type="gramEnd"/>
+            <w:r>
+              <w:rPr>
+                <w:rFonts w:ascii="Arial" w:hAnsi="Arial"/>
+                <w:b/>
+                <w:sz w:val="17"/>
+              </w:rPr>
+            </w:r>
+            <w:proofErr w:type="spellStart"/>
+            <w:r>
+              <w:rPr>
+                <w:rFonts w:ascii="Arial" w:hAnsi="Arial"/>
+                <w:b/>
+                <w:sz w:val="17"/>
+              </w:rPr>
+            </w:r>
+            <w:proofErr w:type="spellEnd"/>
             <w:r>
               <w:rPr>
                 <w:rFonts w:ascii="Arial" w:hAnsi="Arial"/>
@@ -534,6 +609,7 @@
             <w:pPr>
               <w:spacing w:after="0" w:line="252" w:lineRule="auto"/>
             </w:pPr>
+            <w:proofErr w:type="gramStart"/>
             <w:r>
               <w:rPr>
                 <w:rFonts w:ascii="Arial" w:hAnsi="Arial"/>
@@ -541,6 +617,30 @@
                 <w:sz w:val="17"/>
               </w:rPr>
               <w:t>{{CB_LINHA12}} Linha 12</w:t>
+            </w:r>
+            <w:proofErr w:type="gramEnd"/>
+            <w:r>
+              <w:rPr>
+                <w:rFonts w:ascii="Arial" w:hAnsi="Arial"/>
+                <w:b/>
+                <w:sz w:val="17"/>
+              </w:rPr>
+            </w:r>
+            <w:proofErr w:type="spellStart"/>
+            <w:r>
+              <w:rPr>
+                <w:rFonts w:ascii="Arial" w:hAnsi="Arial"/>
+                <w:b/>
+                <w:sz w:val="17"/>
+              </w:rPr>
+            </w:r>
+            <w:proofErr w:type="spellEnd"/>
+            <w:r>
+              <w:rPr>
+                <w:rFonts w:ascii="Arial" w:hAnsi="Arial"/>
+                <w:b/>
+                <w:sz w:val="17"/>
+              </w:rPr>
             </w:r>
           </w:p>
         </w:tc>
@@ -565,6 +665,7 @@
             <w:pPr>
               <w:spacing w:after="0" w:line="252" w:lineRule="auto"/>
             </w:pPr>
+            <w:proofErr w:type="gramStart"/>
             <w:r>
               <w:rPr>
                 <w:rFonts w:ascii="Arial" w:hAnsi="Arial"/>
@@ -572,6 +673,30 @@
                 <w:sz w:val="17"/>
               </w:rPr>
               <w:t>{{CB_LINHA13}} Linha 13</w:t>
+            </w:r>
+            <w:proofErr w:type="gramEnd"/>
+            <w:r>
+              <w:rPr>
+                <w:rFonts w:ascii="Arial" w:hAnsi="Arial"/>
+                <w:b/>
+                <w:sz w:val="17"/>
+              </w:rPr>
+            </w:r>
+            <w:proofErr w:type="spellStart"/>
+            <w:r>
+              <w:rPr>
+                <w:rFonts w:ascii="Arial" w:hAnsi="Arial"/>
+                <w:b/>
+                <w:sz w:val="17"/>
+              </w:rPr>
+            </w:r>
+            <w:proofErr w:type="spellEnd"/>
+            <w:r>
+              <w:rPr>
+                <w:rFonts w:ascii="Arial" w:hAnsi="Arial"/>
+                <w:b/>
+                <w:sz w:val="17"/>
+              </w:rPr>
             </w:r>
           </w:p>
         </w:tc>
@@ -856,6 +981,40 @@
               </w:rPr>
               <w:t>{{OPERADOR_CCM}}</w:t>
             </w:r>
+            <w:r>
+              <w:rPr>
+                <w:rFonts w:ascii="Arial" w:hAnsi="Arial"/>
+                <w:sz w:val="17"/>
+              </w:rPr>
+            </w:r>
+            <w:proofErr w:type="spellStart"/>
+            <w:r>
+              <w:rPr>
+                <w:rFonts w:ascii="Arial" w:hAnsi="Arial"/>
+                <w:sz w:val="17"/>
+              </w:rPr>
+            </w:r>
+            <w:proofErr w:type="spellEnd"/>
+            <w:r>
+              <w:rPr>
+                <w:rFonts w:ascii="Arial" w:hAnsi="Arial"/>
+                <w:sz w:val="17"/>
+              </w:rPr>
+            </w:r>
+            <w:proofErr w:type="spellStart"/>
+            <w:r>
+              <w:rPr>
+                <w:rFonts w:ascii="Arial" w:hAnsi="Arial"/>
+                <w:sz w:val="17"/>
+              </w:rPr>
+            </w:r>
+            <w:proofErr w:type="spellEnd"/>
+            <w:r>
+              <w:rPr>
+                <w:rFonts w:ascii="Arial" w:hAnsi="Arial"/>
+                <w:sz w:val="17"/>
+              </w:rPr>
+            </w:r>
           </w:p>
         </w:tc>
         <w:tc>
@@ -916,6 +1075,20 @@
                 <w:sz w:val="17"/>
               </w:rPr>
               <w:t>{{RESPONSAVEL_RAD}}</w:t>
+            </w:r>
+            <w:proofErr w:type="spellStart"/>
+            <w:r>
+              <w:rPr>
+                <w:rFonts w:ascii="Arial" w:hAnsi="Arial"/>
+                <w:sz w:val="17"/>
+              </w:rPr>
+            </w:r>
+            <w:proofErr w:type="spellEnd"/>
+            <w:r>
+              <w:rPr>
+                <w:rFonts w:ascii="Arial" w:hAnsi="Arial"/>
+                <w:sz w:val="17"/>
+              </w:rPr>
             </w:r>
           </w:p>
         </w:tc>
@@ -1044,6 +1217,38 @@
               </w:rPr>
               <w:t>{{H_PROGRAMADO}}</w:t>
             </w:r>
+            <w:proofErr w:type="spellStart"/>
+            <w:r>
+              <w:rPr>
+                <w:rFonts w:ascii="Arial" w:hAnsi="Arial"/>
+                <w:b/>
+                <w:sz w:val="17"/>
+              </w:rPr>
+            </w:r>
+            <w:proofErr w:type="spellEnd"/>
+            <w:r>
+              <w:rPr>
+                <w:rFonts w:ascii="Arial" w:hAnsi="Arial"/>
+                <w:b/>
+                <w:sz w:val="17"/>
+              </w:rPr>
+            </w:r>
+            <w:proofErr w:type="spellStart"/>
+            <w:r>
+              <w:rPr>
+                <w:rFonts w:ascii="Arial" w:hAnsi="Arial"/>
+                <w:b/>
+                <w:sz w:val="17"/>
+              </w:rPr>
+            </w:r>
+            <w:proofErr w:type="spellEnd"/>
+            <w:r>
+              <w:rPr>
+                <w:rFonts w:ascii="Arial" w:hAnsi="Arial"/>
+                <w:b/>
+                <w:sz w:val="17"/>
+              </w:rPr>
+            </w:r>
           </w:p>
         </w:tc>
         <w:tc>
@@ -1106,6 +1311,38 @@
               </w:rPr>
               <w:t>{{H_EXECUTADO}}</w:t>
             </w:r>
+            <w:proofErr w:type="spellStart"/>
+            <w:r>
+              <w:rPr>
+                <w:rFonts w:ascii="Arial" w:hAnsi="Arial"/>
+                <w:b/>
+                <w:sz w:val="17"/>
+              </w:rPr>
+            </w:r>
+            <w:proofErr w:type="spellEnd"/>
+            <w:r>
+              <w:rPr>
+                <w:rFonts w:ascii="Arial" w:hAnsi="Arial"/>
+                <w:b/>
+                <w:sz w:val="17"/>
+              </w:rPr>
+            </w:r>
+            <w:proofErr w:type="spellStart"/>
+            <w:r>
+              <w:rPr>
+                <w:rFonts w:ascii="Arial" w:hAnsi="Arial"/>
+                <w:b/>
+                <w:sz w:val="17"/>
+              </w:rPr>
+            </w:r>
+            <w:proofErr w:type="spellEnd"/>
+            <w:r>
+              <w:rPr>
+                <w:rFonts w:ascii="Arial" w:hAnsi="Arial"/>
+                <w:b/>
+                <w:sz w:val="17"/>
+              </w:rPr>
+            </w:r>
           </w:p>
         </w:tc>
       </w:tr>
@@ -1128,13 +1365,42 @@
                 <w:b/>
                 <w:color w:val="1F497D"/>
               </w:rPr>
-              <w:t>1. Descrição Técnica da Atividade</w:t>
-            </w:r>
+              <w:t xml:space="preserve">1. </w:t>
+            </w:r>
+            <w:proofErr w:type="spellStart"/>
+            <w:r>
+              <w:rPr>
+                <w:rFonts w:ascii="Arial" w:hAnsi="Arial"/>
+                <w:b/>
+                <w:color w:val="1F497D"/>
+              </w:rPr>
+              <w:t>Descrição</w:t>
+            </w:r>
+            <w:proofErr w:type="spellEnd"/>
+            <w:r>
+              <w:rPr>
+                <w:rFonts w:ascii="Arial" w:hAnsi="Arial"/>
+                <w:b/>
+                <w:color w:val="1F497D"/>
+              </w:rPr>
+              <w:t xml:space="preserve"> Técnica da </w:t>
+            </w:r>
+            <w:proofErr w:type="spellStart"/>
+            <w:r>
+              <w:rPr>
+                <w:rFonts w:ascii="Arial" w:hAnsi="Arial"/>
+                <w:b/>
+                <w:color w:val="1F497D"/>
+              </w:rPr>
+              <w:t>Atividade</w:t>
+            </w:r>
+            <w:proofErr w:type="spellEnd"/>
           </w:p>
         </w:tc>
       </w:tr>
       <w:tr>
         <w:trPr>
+          <w:trHeight w:val="4444"/>
           <w:jc w:val="center"/>
         </w:trPr>
         <w:tc>
@@ -1169,6 +1435,7 @@
               </w:rPr>
               <w:t>{{DESCRICAO_TECNICA}}</w:t>
             </w:r>
+            <w:proofErr w:type="spellStart"/>
             <w:r>
               <w:rPr>
                 <w:rFonts w:ascii="Arial" w:hAnsi="Arial"/>
@@ -1177,6 +1444,7 @@
                 <w:sz w:val="17"/>
               </w:rPr>
             </w:r>
+            <w:proofErr w:type="spellEnd"/>
             <w:r>
               <w:rPr>
                 <w:rFonts w:ascii="Arial" w:hAnsi="Arial"/>
@@ -1185,6 +1453,34 @@
                 <w:sz w:val="17"/>
               </w:rPr>
             </w:r>
+            <w:proofErr w:type="spellStart"/>
+            <w:proofErr w:type="gramStart"/>
+            <w:r>
+              <w:rPr>
+                <w:rFonts w:ascii="Arial" w:hAnsi="Arial"/>
+                <w:b/>
+                <w:bCs/>
+                <w:sz w:val="17"/>
+              </w:rPr>
+            </w:r>
+            <w:proofErr w:type="spellEnd"/>
+            <w:r>
+              <w:rPr>
+                <w:rFonts w:ascii="Arial" w:hAnsi="Arial"/>
+                <w:b/>
+                <w:bCs/>
+                <w:sz w:val="17"/>
+              </w:rPr>
+            </w:r>
+            <w:r>
+              <w:rPr>
+                <w:rFonts w:ascii="Arial" w:hAnsi="Arial"/>
+                <w:b/>
+                <w:bCs/>
+                <w:sz w:val="17"/>
+              </w:rPr>
+            </w:r>
+            <w:proofErr w:type="gramEnd"/>
           </w:p>
           <w:p>
             <w:pPr>
@@ -1239,8 +1535,36 @@
                 <w:b/>
                 <w:color w:val="1F497D"/>
               </w:rPr>
-              <w:t>2. Atividades Executadas</w:t>
-            </w:r>
+              <w:t xml:space="preserve">2. </w:t>
+            </w:r>
+            <w:proofErr w:type="spellStart"/>
+            <w:r>
+              <w:rPr>
+                <w:rFonts w:ascii="Arial" w:hAnsi="Arial"/>
+                <w:b/>
+                <w:color w:val="1F497D"/>
+              </w:rPr>
+              <w:t>Atividades</w:t>
+            </w:r>
+            <w:proofErr w:type="spellEnd"/>
+            <w:r>
+              <w:rPr>
+                <w:rFonts w:ascii="Arial" w:hAnsi="Arial"/>
+                <w:b/>
+                <w:color w:val="1F497D"/>
+              </w:rPr>
+              <w:t xml:space="preserve"> </w:t>
+            </w:r>
+            <w:proofErr w:type="spellStart"/>
+            <w:r>
+              <w:rPr>
+                <w:rFonts w:ascii="Arial" w:hAnsi="Arial"/>
+                <w:b/>
+                <w:color w:val="1F497D"/>
+              </w:rPr>
+              <w:t>Executadas</w:t>
+            </w:r>
+            <w:proofErr w:type="spellEnd"/>
           </w:p>
         </w:tc>
       </w:tr>
@@ -1271,7 +1595,15 @@
               <w:jc w:val="center"/>
             </w:pPr>
             <w:r>
-              <w:t>[Atividade 1]</w:t>
+              <w:t>[</w:t>
+            </w:r>
+            <w:proofErr w:type="spellStart"/>
+            <w:r>
+              <w:t>Atividade</w:t>
+            </w:r>
+            <w:proofErr w:type="spellEnd"/>
+            <w:r>
+              <w:t xml:space="preserve"> 1]</w:t>
             </w:r>
           </w:p>
         </w:tc>
@@ -1298,7 +1630,15 @@
               <w:jc w:val="center"/>
             </w:pPr>
             <w:r>
-              <w:t>[Atividade 2]</w:t>
+              <w:t>[</w:t>
+            </w:r>
+            <w:proofErr w:type="spellStart"/>
+            <w:r>
+              <w:t>Atividade</w:t>
+            </w:r>
+            <w:proofErr w:type="spellEnd"/>
+            <w:r>
+              <w:t xml:space="preserve"> 2]</w:t>
             </w:r>
           </w:p>
         </w:tc>
@@ -1325,7 +1665,15 @@
               <w:jc w:val="center"/>
             </w:pPr>
             <w:r>
-              <w:t>[Atividade 3]</w:t>
+              <w:t>[</w:t>
+            </w:r>
+            <w:proofErr w:type="spellStart"/>
+            <w:r>
+              <w:t>Atividade</w:t>
+            </w:r>
+            <w:proofErr w:type="spellEnd"/>
+            <w:r>
+              <w:t xml:space="preserve"> 3]</w:t>
             </w:r>
           </w:p>
         </w:tc>
@@ -1352,7 +1700,15 @@
               <w:jc w:val="center"/>
             </w:pPr>
             <w:r>
-              <w:t>[Atividade 4]</w:t>
+              <w:t>[</w:t>
+            </w:r>
+            <w:proofErr w:type="spellStart"/>
+            <w:r>
+              <w:t>Atividade</w:t>
+            </w:r>
+            <w:proofErr w:type="spellEnd"/>
+            <w:r>
+              <w:t xml:space="preserve"> 4]</w:t>
             </w:r>
           </w:p>
         </w:tc>
@@ -1389,7 +1745,15 @@
               </w:rPr>
             </w:pPr>
             <w:r>
-              <w:t>[Atividade 5]</w:t>
+              <w:t>[</w:t>
+            </w:r>
+            <w:proofErr w:type="spellStart"/>
+            <w:r>
+              <w:t>Atividade</w:t>
+            </w:r>
+            <w:proofErr w:type="spellEnd"/>
+            <w:r>
+              <w:t xml:space="preserve"> 5]</w:t>
             </w:r>
           </w:p>
         </w:tc>
@@ -1421,7 +1785,15 @@
               </w:rPr>
             </w:pPr>
             <w:r>
-              <w:t>[Atividade 6]</w:t>
+              <w:t>[</w:t>
+            </w:r>
+            <w:proofErr w:type="spellStart"/>
+            <w:r>
+              <w:t>Atividade</w:t>
+            </w:r>
+            <w:proofErr w:type="spellEnd"/>
+            <w:r>
+              <w:t xml:space="preserve"> 6]</w:t>
             </w:r>
           </w:p>
         </w:tc>
@@ -1453,7 +1825,15 @@
               </w:rPr>
             </w:pPr>
             <w:r>
-              <w:t>[Atividade 7]</w:t>
+              <w:t>[</w:t>
+            </w:r>
+            <w:proofErr w:type="spellStart"/>
+            <w:r>
+              <w:t>Atividade</w:t>
+            </w:r>
+            <w:proofErr w:type="spellEnd"/>
+            <w:r>
+              <w:t xml:space="preserve"> 7]</w:t>
             </w:r>
           </w:p>
         </w:tc>
@@ -1485,7 +1865,15 @@
               </w:rPr>
             </w:pPr>
             <w:r>
-              <w:t>[Atividade 8]</w:t>
+              <w:t>[</w:t>
+            </w:r>
+            <w:proofErr w:type="spellStart"/>
+            <w:r>
+              <w:t>Atividade</w:t>
+            </w:r>
+            <w:proofErr w:type="spellEnd"/>
+            <w:r>
+              <w:t xml:space="preserve"> 8]</w:t>
             </w:r>
           </w:p>
         </w:tc>
@@ -1522,8 +1910,36 @@
                 <w:b/>
                 <w:color w:val="1F497D"/>
               </w:rPr>
-              <w:t>3. Equipes Envolvidas e Responsáveis</w:t>
-            </w:r>
+              <w:t xml:space="preserve">3. Equipes </w:t>
+            </w:r>
+            <w:proofErr w:type="spellStart"/>
+            <w:r>
+              <w:rPr>
+                <w:rFonts w:ascii="Arial" w:hAnsi="Arial"/>
+                <w:b/>
+                <w:color w:val="1F497D"/>
+              </w:rPr>
+              <w:t>Envolvidas</w:t>
+            </w:r>
+            <w:proofErr w:type="spellEnd"/>
+            <w:r>
+              <w:rPr>
+                <w:rFonts w:ascii="Arial" w:hAnsi="Arial"/>
+                <w:b/>
+                <w:color w:val="1F497D"/>
+              </w:rPr>
+              <w:t xml:space="preserve"> e </w:t>
+            </w:r>
+            <w:proofErr w:type="spellStart"/>
+            <w:r>
+              <w:rPr>
+                <w:rFonts w:ascii="Arial" w:hAnsi="Arial"/>
+                <w:b/>
+                <w:color w:val="1F497D"/>
+              </w:rPr>
+              <w:t>Responsáveis</w:t>
+            </w:r>
+            <w:proofErr w:type="spellEnd"/>
           </w:p>
         </w:tc>
       </w:tr>
@@ -1555,6 +1971,7 @@
               <w:spacing w:after="0" w:line="252" w:lineRule="auto"/>
               <w:jc w:val="center"/>
             </w:pPr>
+            <w:proofErr w:type="gramStart"/>
             <w:r>
               <w:rPr>
                 <w:rFonts w:ascii="Arial" w:hAnsi="Arial"/>
@@ -1570,6 +1987,14 @@
                 <w:sz w:val="17"/>
               </w:rPr>
             </w:r>
+            <w:r>
+              <w:rPr>
+                <w:rFonts w:ascii="Arial" w:hAnsi="Arial"/>
+                <w:b/>
+                <w:sz w:val="17"/>
+              </w:rPr>
+            </w:r>
+            <w:proofErr w:type="gramEnd"/>
             <w:r>
               <w:rPr>
                 <w:rFonts w:ascii="Arial" w:hAnsi="Arial"/>
@@ -1601,6 +2026,7 @@
               <w:spacing w:after="0" w:line="252" w:lineRule="auto"/>
               <w:jc w:val="center"/>
             </w:pPr>
+            <w:proofErr w:type="gramStart"/>
             <w:r>
               <w:rPr>
                 <w:rFonts w:ascii="Arial" w:hAnsi="Arial"/>
@@ -1608,6 +2034,14 @@
                 <w:sz w:val="17"/>
               </w:rPr>
               <w:t>{{CB_VP}} VP</w:t>
+            </w:r>
+            <w:proofErr w:type="gramEnd"/>
+            <w:r>
+              <w:rPr>
+                <w:rFonts w:ascii="Arial" w:hAnsi="Arial"/>
+                <w:b/>
+                <w:sz w:val="17"/>
+              </w:rPr>
             </w:r>
           </w:p>
         </w:tc>
@@ -1627,6 +2061,7 @@
               <w:spacing w:after="0" w:line="252" w:lineRule="auto"/>
               <w:jc w:val="center"/>
             </w:pPr>
+            <w:proofErr w:type="gramStart"/>
             <w:r>
               <w:rPr>
                 <w:rFonts w:ascii="Arial" w:hAnsi="Arial"/>
@@ -1634,6 +2069,14 @@
                 <w:sz w:val="17"/>
               </w:rPr>
               <w:t>{{CB_MRO}} MRO</w:t>
+            </w:r>
+            <w:proofErr w:type="gramEnd"/>
+            <w:r>
+              <w:rPr>
+                <w:rFonts w:ascii="Arial" w:hAnsi="Arial"/>
+                <w:b/>
+                <w:sz w:val="17"/>
+              </w:rPr>
             </w:r>
           </w:p>
         </w:tc>
@@ -1659,6 +2102,7 @@
               <w:spacing w:after="0" w:line="252" w:lineRule="auto"/>
               <w:jc w:val="center"/>
             </w:pPr>
+            <w:proofErr w:type="gramStart"/>
             <w:r>
               <w:rPr>
                 <w:rFonts w:ascii="Arial" w:hAnsi="Arial"/>
@@ -1666,6 +2110,14 @@
                 <w:sz w:val="17"/>
               </w:rPr>
               <w:t xml:space="preserve">{{CB_CIVIL}} CIVIL </w:t>
+            </w:r>
+            <w:proofErr w:type="gramEnd"/>
+            <w:r>
+              <w:rPr>
+                <w:rFonts w:ascii="Arial" w:hAnsi="Arial"/>
+                <w:b/>
+                <w:sz w:val="17"/>
+              </w:rPr>
             </w:r>
           </w:p>
         </w:tc>
@@ -1691,6 +2143,7 @@
               <w:spacing w:after="0" w:line="252" w:lineRule="auto"/>
               <w:jc w:val="center"/>
             </w:pPr>
+            <w:proofErr w:type="gramStart"/>
             <w:r>
               <w:rPr>
                 <w:rFonts w:ascii="Arial" w:hAnsi="Arial"/>
@@ -1698,6 +2151,14 @@
                 <w:sz w:val="17"/>
               </w:rPr>
               <w:t>{{CB_RESTAB}} RESTAB</w:t>
+            </w:r>
+            <w:proofErr w:type="gramEnd"/>
+            <w:r>
+              <w:rPr>
+                <w:rFonts w:ascii="Arial" w:hAnsi="Arial"/>
+                <w:b/>
+                <w:sz w:val="17"/>
+              </w:rPr>
             </w:r>
           </w:p>
         </w:tc>
@@ -1735,6 +2196,7 @@
                 <w:sz w:val="17"/>
               </w:rPr>
             </w:pPr>
+            <w:proofErr w:type="gramStart"/>
             <w:r>
               <w:rPr>
                 <w:rFonts w:ascii="Arial" w:hAnsi="Arial"/>
@@ -1743,6 +2205,7 @@
               </w:rPr>
               <w:t>{{CB_SINAL}} SINAL</w:t>
             </w:r>
+            <w:proofErr w:type="gramEnd"/>
             <w:r>
               <w:rPr>
                 <w:rFonts w:ascii="Arial" w:hAnsi="Arial"/>
@@ -1772,27 +2235,12 @@
           <w:p>
             <w:pPr>
               <w:spacing w:after="0" w:line="252" w:lineRule="auto"/>
-              <w:jc w:val="center"/>
               <w:rPr>
                 <w:rFonts w:ascii="Arial" w:hAnsi="Arial"/>
                 <w:b/>
                 <w:sz w:val="17"/>
               </w:rPr>
             </w:pPr>
-            <w:r>
-              <w:rPr>
-                <w:rFonts w:ascii="Arial" w:hAnsi="Arial"/>
-                <w:b/>
-                <w:sz w:val="17"/>
-              </w:rPr>
-            </w:r>
-            <w:r>
-              <w:rPr>
-                <w:rFonts w:ascii="Arial" w:hAnsi="Arial"/>
-                <w:b/>
-                <w:sz w:val="17"/>
-              </w:rPr>
-            </w:r>
           </w:p>
         </w:tc>
         <w:tc>
@@ -1898,20 +2346,30 @@
               </w:rPr>
               <w:t xml:space="preserve">4. </w:t>
             </w:r>
+            <w:proofErr w:type="spellStart"/>
             <w:r>
               <w:rPr>
                 <w:rFonts w:ascii="Arial" w:hAnsi="Arial"/>
                 <w:b/>
                 <w:color w:val="1F497D"/>
               </w:rPr>
-              <w:t>Observações Gerais</w:t>
+              <w:t>Observações</w:t>
+            </w:r>
+            <w:proofErr w:type="spellEnd"/>
+            <w:r>
+              <w:rPr>
+                <w:rFonts w:ascii="Arial" w:hAnsi="Arial"/>
+                <w:b/>
+                <w:color w:val="1F497D"/>
+              </w:rPr>
+              <w:t xml:space="preserve"> Gerais</w:t>
             </w:r>
           </w:p>
         </w:tc>
       </w:tr>
       <w:tr>
         <w:trPr>
-          <w:trHeight w:val="1239"/>
+          <w:trHeight w:val="2575"/>
           <w:jc w:val="center"/>
         </w:trPr>
         <w:tc>
@@ -1976,20 +2434,77 @@
           <w:p>
             <w:pPr>
               <w:spacing w:before="120" w:after="80"/>
+              <w:rPr>
+                <w:rFonts w:ascii="Arial" w:hAnsi="Arial"/>
+                <w:b/>
+                <w:color w:val="1F497D"/>
+              </w:rPr>
             </w:pPr>
+          </w:p>
+          <w:p>
+            <w:pPr>
+              <w:spacing w:before="120" w:after="80"/>
+            </w:pPr>
             <w:r>
               <w:rPr>
                 <w:rFonts w:ascii="Arial" w:hAnsi="Arial"/>
                 <w:b/>
                 <w:color w:val="1F497D"/>
               </w:rPr>
-              <w:t>5. Relatório Fotográfico das Atividades</w:t>
-            </w:r>
+              <w:t xml:space="preserve">5. </w:t>
+            </w:r>
+            <w:proofErr w:type="spellStart"/>
+            <w:r>
+              <w:rPr>
+                <w:rFonts w:ascii="Arial" w:hAnsi="Arial"/>
+                <w:b/>
+                <w:color w:val="1F497D"/>
+              </w:rPr>
+              <w:t>Relatório</w:t>
+            </w:r>
+            <w:proofErr w:type="spellEnd"/>
+            <w:r>
+              <w:rPr>
+                <w:rFonts w:ascii="Arial" w:hAnsi="Arial"/>
+                <w:b/>
+                <w:color w:val="1F497D"/>
+              </w:rPr>
+              <w:t xml:space="preserve"> </w:t>
+            </w:r>
+            <w:proofErr w:type="spellStart"/>
+            <w:r>
+              <w:rPr>
+                <w:rFonts w:ascii="Arial" w:hAnsi="Arial"/>
+                <w:b/>
+                <w:color w:val="1F497D"/>
+              </w:rPr>
+              <w:t>Fotográfico</w:t>
+            </w:r>
+            <w:proofErr w:type="spellEnd"/>
+            <w:r>
+              <w:rPr>
+                <w:rFonts w:ascii="Arial" w:hAnsi="Arial"/>
+                <w:b/>
+                <w:color w:val="1F497D"/>
+              </w:rPr>
+              <w:t xml:space="preserve"> das </w:t>
+            </w:r>
+            <w:proofErr w:type="spellStart"/>
+            <w:r>
+              <w:rPr>
+                <w:rFonts w:ascii="Arial" w:hAnsi="Arial"/>
+                <w:b/>
+                <w:color w:val="1F497D"/>
+              </w:rPr>
+              <w:t>Atividades</w:t>
+            </w:r>
+            <w:proofErr w:type="spellEnd"/>
           </w:p>
         </w:tc>
       </w:tr>
       <w:tr>
         <w:trPr>
+          <w:trHeight w:val="33"/>
           <w:jc w:val="center"/>
         </w:trPr>
         <w:tc>
@@ -2061,6 +2576,7 @@
       </w:tr>
       <w:tr>
         <w:trPr>
+          <w:trHeight w:val="3197"/>
           <w:jc w:val="center"/>
         </w:trPr>
         <w:tc>
@@ -2127,6 +2643,7 @@
                 <w:sz w:val="17"/>
               </w:rPr>
             </w:r>
+            <w:proofErr w:type="spellStart"/>
             <w:r>
               <w:rPr>
                 <w:rFonts w:ascii="Arial" w:hAnsi="Arial"/>
@@ -2135,6 +2652,7 @@
                 <w:sz w:val="17"/>
               </w:rPr>
             </w:r>
+            <w:proofErr w:type="spellEnd"/>
             <w:r>
               <w:rPr>
                 <w:rFonts w:ascii="Arial" w:hAnsi="Arial"/>
@@ -2143,12 +2661,110 @@
                 <w:sz w:val="17"/>
               </w:rPr>
             </w:r>
-            <w:r>
-              <w:rPr>
-                <w:rFonts w:ascii="Arial" w:hAnsi="Arial"/>
-                <w:sz w:val="17"/>
-              </w:rPr>
-            </w:r>
+            <w:proofErr w:type="spellStart"/>
+            <w:r>
+              <w:rPr>
+                <w:rFonts w:ascii="Arial" w:hAnsi="Arial"/>
+                <w:b/>
+                <w:bCs/>
+                <w:sz w:val="17"/>
+              </w:rPr>
+            </w:r>
+            <w:proofErr w:type="spellEnd"/>
+            <w:r>
+              <w:rPr>
+                <w:rFonts w:ascii="Arial" w:hAnsi="Arial"/>
+                <w:b/>
+                <w:bCs/>
+                <w:sz w:val="17"/>
+              </w:rPr>
+            </w:r>
+            <w:proofErr w:type="gramStart"/>
+            <w:r>
+              <w:rPr>
+                <w:rFonts w:ascii="Arial" w:hAnsi="Arial"/>
+                <w:b/>
+                <w:bCs/>
+                <w:sz w:val="17"/>
+              </w:rPr>
+            </w:r>
+            <w:r>
+              <w:rPr>
+                <w:rFonts w:ascii="Arial" w:hAnsi="Arial"/>
+                <w:b/>
+                <w:bCs/>
+                <w:sz w:val="17"/>
+              </w:rPr>
+            </w:r>
+            <w:r>
+              <w:rPr>
+                <w:rFonts w:ascii="Arial" w:hAnsi="Arial"/>
+                <w:sz w:val="17"/>
+              </w:rPr>
+            </w:r>
+            <w:proofErr w:type="gramEnd"/>
+            <w:r>
+              <w:rPr>
+                <w:rFonts w:ascii="Arial" w:hAnsi="Arial"/>
+                <w:sz w:val="17"/>
+              </w:rPr>
+            </w:r>
+            <w:r>
+              <w:rPr>
+                <w:rFonts w:ascii="Arial" w:hAnsi="Arial"/>
+                <w:sz w:val="17"/>
+              </w:rPr>
+            </w:r>
+            <w:proofErr w:type="spellStart"/>
+            <w:r>
+              <w:rPr>
+                <w:rFonts w:ascii="Arial" w:hAnsi="Arial"/>
+                <w:sz w:val="17"/>
+              </w:rPr>
+            </w:r>
+            <w:proofErr w:type="spellEnd"/>
+            <w:r>
+              <w:rPr>
+                <w:rFonts w:ascii="Arial" w:hAnsi="Arial"/>
+                <w:sz w:val="17"/>
+              </w:rPr>
+            </w:r>
+            <w:proofErr w:type="spellStart"/>
+            <w:r>
+              <w:rPr>
+                <w:rFonts w:ascii="Arial" w:hAnsi="Arial"/>
+                <w:sz w:val="17"/>
+              </w:rPr>
+            </w:r>
+            <w:proofErr w:type="spellEnd"/>
+            <w:r>
+              <w:rPr>
+                <w:rFonts w:ascii="Arial" w:hAnsi="Arial"/>
+                <w:sz w:val="17"/>
+              </w:rPr>
+            </w:r>
+            <w:proofErr w:type="spellStart"/>
+            <w:r>
+              <w:rPr>
+                <w:rFonts w:ascii="Arial" w:hAnsi="Arial"/>
+                <w:sz w:val="17"/>
+              </w:rPr>
+            </w:r>
+            <w:proofErr w:type="spellEnd"/>
+            <w:r>
+              <w:rPr>
+                <w:rFonts w:ascii="Arial" w:hAnsi="Arial"/>
+                <w:sz w:val="17"/>
+              </w:rPr>
+            </w:r>
+            <w:proofErr w:type="spellStart"/>
+            <w:r>
+              <w:rPr>
+                <w:rFonts w:ascii="Arial" w:hAnsi="Arial"/>
+                <w:sz w:val="17"/>
+              </w:rPr>
+            </w:r>
+            <w:proofErr w:type="spellEnd"/>
             <w:r>
               <w:rPr>
                 <w:rFonts w:ascii="Arial" w:hAnsi="Arial"/>
@@ -2209,67 +2825,7 @@
                 <w:rFonts w:ascii="Arial" w:hAnsi="Arial"/>
                 <w:sz w:val="17"/>
               </w:rPr>
-              <w:br/>
-            </w:r>
-            <w:r>
-              <w:rPr>
-                <w:rFonts w:ascii="Arial" w:hAnsi="Arial"/>
-                <w:sz w:val="17"/>
-              </w:rPr>
-              <w:br/>
-            </w:r>
-            <w:r>
-              <w:rPr>
-                <w:rFonts w:ascii="Arial" w:hAnsi="Arial"/>
-                <w:sz w:val="17"/>
-              </w:rPr>
-              <w:br/>
-            </w:r>
-            <w:r>
-              <w:rPr>
-                <w:rFonts w:ascii="Arial" w:hAnsi="Arial"/>
-                <w:sz w:val="17"/>
-              </w:rPr>
-              <w:br/>
-              <w:t xml:space="preserve">[ </w:t>
-            </w:r>
-            <w:r>
-              <w:rPr>
-                <w:rFonts w:ascii="Arial" w:hAnsi="Arial"/>
-                <w:sz w:val="17"/>
-              </w:rPr>
-              <w:t xml:space="preserve">Campo </w:t>
-            </w:r>
-            <w:r>
-              <w:rPr>
-                <w:rFonts w:ascii="Arial" w:hAnsi="Arial"/>
-                <w:b/>
-                <w:bCs/>
-                <w:sz w:val="17"/>
-              </w:rPr>
-              <w:t>Fotos — Intervenção Verificada </w:t>
-            </w:r>
-            <w:r>
-              <w:rPr>
-                <w:rFonts w:ascii="Arial" w:hAnsi="Arial"/>
-                <w:b/>
-                <w:bCs/>
-                <w:sz w:val="17"/>
-              </w:rPr>
-              <w:t>2</w:t>
-            </w:r>
-            <w:r>
-              <w:rPr>
-                <w:rFonts w:ascii="Arial" w:hAnsi="Arial"/>
-                <w:sz w:val="17"/>
-              </w:rPr>
-              <w:t>]</w:t>
-            </w:r>
-            <w:r>
-              <w:rPr>
-                <w:rFonts w:ascii="Arial" w:hAnsi="Arial"/>
-                <w:sz w:val="17"/>
-              </w:rPr>
+              <w:t>FOTO 2</w:t>
               <w:br/>
               <w:t>(Clique aqui e insira a foto correspondente)</w:t>
             </w:r>
@@ -2278,35 +2834,179 @@
                 <w:rFonts w:ascii="Arial" w:hAnsi="Arial"/>
                 <w:sz w:val="17"/>
               </w:rPr>
-              <w:br/>
-            </w:r>
-            <w:r>
-              <w:rPr>
-                <w:rFonts w:ascii="Arial" w:hAnsi="Arial"/>
-                <w:sz w:val="17"/>
-              </w:rPr>
-              <w:br/>
-            </w:r>
-            <w:r>
-              <w:rPr>
-                <w:rFonts w:ascii="Arial" w:hAnsi="Arial"/>
-                <w:sz w:val="17"/>
-              </w:rPr>
-              <w:br/>
-            </w:r>
-            <w:r>
-              <w:rPr>
-                <w:rFonts w:ascii="Arial" w:hAnsi="Arial"/>
-                <w:sz w:val="17"/>
-              </w:rPr>
-              <w:br/>
+            </w:r>
+            <w:r>
+              <w:rPr>
+                <w:rFonts w:ascii="Arial" w:hAnsi="Arial"/>
+                <w:sz w:val="17"/>
+              </w:rPr>
+            </w:r>
+            <w:r>
+              <w:rPr>
+                <w:rFonts w:ascii="Arial" w:hAnsi="Arial"/>
+                <w:sz w:val="17"/>
+              </w:rPr>
+            </w:r>
+            <w:r>
+              <w:rPr>
+                <w:rFonts w:ascii="Arial" w:hAnsi="Arial"/>
+                <w:sz w:val="17"/>
+              </w:rPr>
+            </w:r>
+            <w:r>
+              <w:rPr>
+                <w:rFonts w:ascii="Arial" w:hAnsi="Arial"/>
+                <w:b/>
+                <w:bCs/>
+                <w:sz w:val="17"/>
+              </w:rPr>
+            </w:r>
+            <w:proofErr w:type="spellStart"/>
+            <w:r>
+              <w:rPr>
+                <w:rFonts w:ascii="Arial" w:hAnsi="Arial"/>
+                <w:b/>
+                <w:bCs/>
+                <w:sz w:val="17"/>
+              </w:rPr>
+            </w:r>
+            <w:proofErr w:type="spellEnd"/>
+            <w:r>
+              <w:rPr>
+                <w:rFonts w:ascii="Arial" w:hAnsi="Arial"/>
+                <w:b/>
+                <w:bCs/>
+                <w:sz w:val="17"/>
+              </w:rPr>
+            </w:r>
+            <w:proofErr w:type="spellStart"/>
+            <w:r>
+              <w:rPr>
+                <w:rFonts w:ascii="Arial" w:hAnsi="Arial"/>
+                <w:b/>
+                <w:bCs/>
+                <w:sz w:val="17"/>
+              </w:rPr>
+            </w:r>
+            <w:proofErr w:type="spellEnd"/>
+            <w:r>
+              <w:rPr>
+                <w:rFonts w:ascii="Arial" w:hAnsi="Arial"/>
+                <w:b/>
+                <w:bCs/>
+                <w:sz w:val="17"/>
+              </w:rPr>
+            </w:r>
+            <w:r>
+              <w:rPr>
+                <w:rFonts w:ascii="Arial" w:hAnsi="Arial"/>
+                <w:sz w:val="17"/>
+              </w:rPr>
+            </w:r>
+            <w:r>
+              <w:rPr>
+                <w:rFonts w:ascii="Arial" w:hAnsi="Arial"/>
+                <w:sz w:val="17"/>
+              </w:rPr>
+            </w:r>
+            <w:r>
+              <w:rPr>
+                <w:rFonts w:ascii="Arial" w:hAnsi="Arial"/>
+                <w:sz w:val="17"/>
+              </w:rPr>
+            </w:r>
+            <w:r>
+              <w:rPr>
+                <w:rFonts w:ascii="Arial" w:hAnsi="Arial"/>
+                <w:sz w:val="17"/>
+              </w:rPr>
+            </w:r>
+            <w:proofErr w:type="spellStart"/>
+            <w:r>
+              <w:rPr>
+                <w:rFonts w:ascii="Arial" w:hAnsi="Arial"/>
+                <w:sz w:val="17"/>
+              </w:rPr>
+            </w:r>
+            <w:proofErr w:type="spellEnd"/>
+            <w:r>
+              <w:rPr>
+                <w:rFonts w:ascii="Arial" w:hAnsi="Arial"/>
+                <w:sz w:val="17"/>
+              </w:rPr>
+            </w:r>
+            <w:proofErr w:type="spellStart"/>
+            <w:r>
+              <w:rPr>
+                <w:rFonts w:ascii="Arial" w:hAnsi="Arial"/>
+                <w:sz w:val="17"/>
+              </w:rPr>
+            </w:r>
+            <w:proofErr w:type="spellEnd"/>
+            <w:r>
+              <w:rPr>
+                <w:rFonts w:ascii="Arial" w:hAnsi="Arial"/>
+                <w:sz w:val="17"/>
+              </w:rPr>
+            </w:r>
+            <w:proofErr w:type="spellStart"/>
+            <w:r>
+              <w:rPr>
+                <w:rFonts w:ascii="Arial" w:hAnsi="Arial"/>
+                <w:sz w:val="17"/>
+              </w:rPr>
+            </w:r>
+            <w:proofErr w:type="spellEnd"/>
+            <w:r>
+              <w:rPr>
+                <w:rFonts w:ascii="Arial" w:hAnsi="Arial"/>
+                <w:sz w:val="17"/>
+              </w:rPr>
+            </w:r>
+            <w:proofErr w:type="spellStart"/>
+            <w:r>
+              <w:rPr>
+                <w:rFonts w:ascii="Arial" w:hAnsi="Arial"/>
+                <w:sz w:val="17"/>
+              </w:rPr>
+            </w:r>
+            <w:proofErr w:type="spellEnd"/>
+            <w:r>
+              <w:rPr>
+                <w:rFonts w:ascii="Arial" w:hAnsi="Arial"/>
+                <w:sz w:val="17"/>
+              </w:rPr>
+            </w:r>
+            <w:r>
+              <w:rPr>
+                <w:rFonts w:ascii="Arial" w:hAnsi="Arial"/>
+                <w:sz w:val="17"/>
+              </w:rPr>
+            </w:r>
+            <w:r>
+              <w:rPr>
+                <w:rFonts w:ascii="Arial" w:hAnsi="Arial"/>
+                <w:sz w:val="17"/>
+              </w:rPr>
+            </w:r>
+            <w:r>
+              <w:rPr>
+                <w:rFonts w:ascii="Arial" w:hAnsi="Arial"/>
+                <w:sz w:val="17"/>
+              </w:rPr>
+            </w:r>
+            <w:r>
+              <w:rPr>
+                <w:rFonts w:ascii="Arial" w:hAnsi="Arial"/>
+                <w:sz w:val="17"/>
+              </w:rPr>
             </w:r>
           </w:p>
         </w:tc>
       </w:tr>
       <w:tr>
         <w:trPr>
-          <w:trHeight w:val="1961"/>
+          <w:trHeight w:val="2923"/>
           <w:jc w:val="center"/>
         </w:trPr>
         <w:tc>
@@ -2337,13 +3037,25 @@
               </w:rPr>
             </w:pPr>
             <w:r>
-              <w:rPr>
-                <w:rFonts w:ascii="Arial" w:hAnsi="Arial"/>
-                <w:sz w:val="17"/>
-              </w:rPr>
-              <w:t>FOTO 2</w:t>
+              <w:t>FOTO 3</w:t>
               <w:br/>
               <w:t>(Clique aqui e insira a foto correspondente)</w:t>
+            </w:r>
+          </w:p>
+          <w:p>
+            <w:pPr>
+              <w:spacing w:after="0" w:line="252" w:lineRule="auto"/>
+              <w:jc w:val="center"/>
+              <w:rPr>
+                <w:rFonts w:ascii="Arial" w:hAnsi="Arial"/>
+                <w:sz w:val="17"/>
+              </w:rPr>
+            </w:pPr>
+            <w:r>
+              <w:rPr>
+                <w:rFonts w:ascii="Arial" w:hAnsi="Arial"/>
+                <w:sz w:val="17"/>
+              </w:rPr>
             </w:r>
           </w:p>
           <w:p>
@@ -2365,6 +3077,7 @@
                 <w:sz w:val="17"/>
               </w:rPr>
             </w:r>
+            <w:proofErr w:type="spellStart"/>
             <w:r>
               <w:rPr>
                 <w:rFonts w:ascii="Arial" w:hAnsi="Arial"/>
@@ -2373,12 +3086,105 @@
                 <w:sz w:val="17"/>
               </w:rPr>
             </w:r>
-            <w:r>
-              <w:rPr>
-                <w:rFonts w:ascii="Arial" w:hAnsi="Arial"/>
-                <w:sz w:val="17"/>
-              </w:rPr>
-            </w:r>
+            <w:proofErr w:type="spellEnd"/>
+            <w:r>
+              <w:rPr>
+                <w:rFonts w:ascii="Arial" w:hAnsi="Arial"/>
+                <w:b/>
+                <w:bCs/>
+                <w:sz w:val="17"/>
+              </w:rPr>
+            </w:r>
+            <w:proofErr w:type="spellStart"/>
+            <w:r>
+              <w:rPr>
+                <w:rFonts w:ascii="Arial" w:hAnsi="Arial"/>
+                <w:b/>
+                <w:bCs/>
+                <w:sz w:val="17"/>
+              </w:rPr>
+            </w:r>
+            <w:proofErr w:type="spellEnd"/>
+            <w:r>
+              <w:rPr>
+                <w:rFonts w:ascii="Arial" w:hAnsi="Arial"/>
+                <w:b/>
+                <w:bCs/>
+                <w:sz w:val="17"/>
+              </w:rPr>
+            </w:r>
+            <w:proofErr w:type="gramStart"/>
+            <w:r>
+              <w:rPr>
+                <w:rFonts w:ascii="Arial" w:hAnsi="Arial"/>
+                <w:b/>
+                <w:bCs/>
+                <w:sz w:val="17"/>
+              </w:rPr>
+            </w:r>
+            <w:proofErr w:type="gramEnd"/>
+            <w:r>
+              <w:rPr>
+                <w:rFonts w:ascii="Arial" w:hAnsi="Arial"/>
+                <w:sz w:val="17"/>
+              </w:rPr>
+            </w:r>
+            <w:r>
+              <w:rPr>
+                <w:rFonts w:ascii="Arial" w:hAnsi="Arial"/>
+                <w:sz w:val="17"/>
+              </w:rPr>
+            </w:r>
+            <w:proofErr w:type="spellStart"/>
+            <w:r>
+              <w:rPr>
+                <w:rFonts w:ascii="Arial" w:hAnsi="Arial"/>
+                <w:sz w:val="17"/>
+              </w:rPr>
+            </w:r>
+            <w:proofErr w:type="spellEnd"/>
+            <w:r>
+              <w:rPr>
+                <w:rFonts w:ascii="Arial" w:hAnsi="Arial"/>
+                <w:sz w:val="17"/>
+              </w:rPr>
+            </w:r>
+            <w:proofErr w:type="spellStart"/>
+            <w:r>
+              <w:rPr>
+                <w:rFonts w:ascii="Arial" w:hAnsi="Arial"/>
+                <w:sz w:val="17"/>
+              </w:rPr>
+            </w:r>
+            <w:proofErr w:type="spellEnd"/>
+            <w:r>
+              <w:rPr>
+                <w:rFonts w:ascii="Arial" w:hAnsi="Arial"/>
+                <w:sz w:val="17"/>
+              </w:rPr>
+            </w:r>
+            <w:proofErr w:type="spellStart"/>
+            <w:r>
+              <w:rPr>
+                <w:rFonts w:ascii="Arial" w:hAnsi="Arial"/>
+                <w:sz w:val="17"/>
+              </w:rPr>
+            </w:r>
+            <w:proofErr w:type="spellEnd"/>
+            <w:r>
+              <w:rPr>
+                <w:rFonts w:ascii="Arial" w:hAnsi="Arial"/>
+                <w:sz w:val="17"/>
+              </w:rPr>
+            </w:r>
+            <w:proofErr w:type="spellStart"/>
+            <w:r>
+              <w:rPr>
+                <w:rFonts w:ascii="Arial" w:hAnsi="Arial"/>
+                <w:sz w:val="17"/>
+              </w:rPr>
+            </w:r>
+            <w:proofErr w:type="spellEnd"/>
             <w:r>
               <w:rPr>
                 <w:rFonts w:ascii="Arial" w:hAnsi="Arial"/>
@@ -2415,6 +3221,10 @@
             <w:pPr>
               <w:spacing w:after="0" w:line="252" w:lineRule="auto"/>
               <w:jc w:val="center"/>
+              <w:rPr>
+                <w:rFonts w:ascii="Arial" w:hAnsi="Arial"/>
+                <w:sz w:val="17"/>
+              </w:rPr>
             </w:pPr>
             <w:r>
               <w:rPr>
@@ -2446,17 +3256,12 @@
             <w:r>
               <w:rPr>
                 <w:rFonts w:ascii="Arial" w:hAnsi="Arial"/>
-                <w:sz w:val="17"/>
-              </w:rPr>
-            </w:r>
-            <w:r>
-              <w:rPr>
-                <w:rFonts w:ascii="Arial" w:hAnsi="Arial"/>
                 <w:b/>
                 <w:bCs/>
                 <w:sz w:val="17"/>
               </w:rPr>
             </w:r>
+            <w:proofErr w:type="spellStart"/>
             <w:r>
               <w:rPr>
                 <w:rFonts w:ascii="Arial" w:hAnsi="Arial"/>
@@ -2465,12 +3270,107 @@
                 <w:sz w:val="17"/>
               </w:rPr>
             </w:r>
-            <w:r>
-              <w:rPr>
-                <w:rFonts w:ascii="Arial" w:hAnsi="Arial"/>
-                <w:sz w:val="17"/>
-              </w:rPr>
-            </w:r>
+            <w:proofErr w:type="spellEnd"/>
+            <w:r>
+              <w:rPr>
+                <w:rFonts w:ascii="Arial" w:hAnsi="Arial"/>
+                <w:b/>
+                <w:bCs/>
+                <w:sz w:val="17"/>
+              </w:rPr>
+            </w:r>
+            <w:proofErr w:type="spellStart"/>
+            <w:r>
+              <w:rPr>
+                <w:rFonts w:ascii="Arial" w:hAnsi="Arial"/>
+                <w:b/>
+                <w:bCs/>
+                <w:sz w:val="17"/>
+              </w:rPr>
+            </w:r>
+            <w:proofErr w:type="spellEnd"/>
+            <w:r>
+              <w:rPr>
+                <w:rFonts w:ascii="Arial" w:hAnsi="Arial"/>
+                <w:b/>
+                <w:bCs/>
+                <w:sz w:val="17"/>
+              </w:rPr>
+            </w:r>
+            <w:r>
+              <w:rPr>
+                <w:rFonts w:ascii="Arial" w:hAnsi="Arial"/>
+                <w:sz w:val="17"/>
+              </w:rPr>
+            </w:r>
+          </w:p>
+          <w:p>
+            <w:pPr>
+              <w:spacing w:after="0" w:line="252" w:lineRule="auto"/>
+              <w:jc w:val="center"/>
+            </w:pPr>
+            <w:r>
+              <w:rPr>
+                <w:rFonts w:ascii="Arial" w:hAnsi="Arial"/>
+                <w:sz w:val="17"/>
+              </w:rPr>
+            </w:r>
+            <w:r>
+              <w:rPr>
+                <w:rFonts w:ascii="Arial" w:hAnsi="Arial"/>
+                <w:sz w:val="17"/>
+              </w:rPr>
+            </w:r>
+            <w:proofErr w:type="spellStart"/>
+            <w:r>
+              <w:rPr>
+                <w:rFonts w:ascii="Arial" w:hAnsi="Arial"/>
+                <w:sz w:val="17"/>
+              </w:rPr>
+            </w:r>
+            <w:proofErr w:type="spellEnd"/>
+            <w:r>
+              <w:rPr>
+                <w:rFonts w:ascii="Arial" w:hAnsi="Arial"/>
+                <w:sz w:val="17"/>
+              </w:rPr>
+            </w:r>
+            <w:proofErr w:type="spellStart"/>
+            <w:r>
+              <w:rPr>
+                <w:rFonts w:ascii="Arial" w:hAnsi="Arial"/>
+                <w:sz w:val="17"/>
+              </w:rPr>
+            </w:r>
+            <w:proofErr w:type="spellEnd"/>
+            <w:r>
+              <w:rPr>
+                <w:rFonts w:ascii="Arial" w:hAnsi="Arial"/>
+                <w:sz w:val="17"/>
+              </w:rPr>
+            </w:r>
+            <w:proofErr w:type="spellStart"/>
+            <w:r>
+              <w:rPr>
+                <w:rFonts w:ascii="Arial" w:hAnsi="Arial"/>
+                <w:sz w:val="17"/>
+              </w:rPr>
+            </w:r>
+            <w:proofErr w:type="spellEnd"/>
+            <w:r>
+              <w:rPr>
+                <w:rFonts w:ascii="Arial" w:hAnsi="Arial"/>
+                <w:sz w:val="17"/>
+              </w:rPr>
+            </w:r>
+            <w:proofErr w:type="spellStart"/>
+            <w:r>
+              <w:rPr>
+                <w:rFonts w:ascii="Arial" w:hAnsi="Arial"/>
+                <w:sz w:val="17"/>
+              </w:rPr>
+            </w:r>
+            <w:proofErr w:type="spellEnd"/>
             <w:r>
               <w:rPr>
                 <w:rFonts w:ascii="Arial" w:hAnsi="Arial"/>
@@ -2539,8 +3439,54 @@
                 <w:b/>
                 <w:color w:val="1F497D"/>
               </w:rPr>
-              <w:t>6. Observações do Relatório Fotográfico</w:t>
-            </w:r>
+              <w:t xml:space="preserve">6. </w:t>
+            </w:r>
+            <w:proofErr w:type="spellStart"/>
+            <w:r>
+              <w:rPr>
+                <w:rFonts w:ascii="Arial" w:hAnsi="Arial"/>
+                <w:b/>
+                <w:color w:val="1F497D"/>
+              </w:rPr>
+              <w:t>Observações</w:t>
+            </w:r>
+            <w:proofErr w:type="spellEnd"/>
+            <w:r>
+              <w:rPr>
+                <w:rFonts w:ascii="Arial" w:hAnsi="Arial"/>
+                <w:b/>
+                <w:color w:val="1F497D"/>
+              </w:rPr>
+              <w:t xml:space="preserve"> do </w:t>
+            </w:r>
+            <w:proofErr w:type="spellStart"/>
+            <w:r>
+              <w:rPr>
+                <w:rFonts w:ascii="Arial" w:hAnsi="Arial"/>
+                <w:b/>
+                <w:color w:val="1F497D"/>
+              </w:rPr>
+              <w:t>Relatório</w:t>
+            </w:r>
+            <w:proofErr w:type="spellEnd"/>
+            <w:r>
+              <w:rPr>
+                <w:rFonts w:ascii="Arial" w:hAnsi="Arial"/>
+                <w:b/>
+                <w:color w:val="1F497D"/>
+              </w:rPr>
+              <w:t xml:space="preserve"> </w:t>
+            </w:r>
+            <w:proofErr w:type="spellStart"/>
+            <w:r>
+              <w:rPr>
+                <w:rFonts w:ascii="Arial" w:hAnsi="Arial"/>
+                <w:b/>
+                <w:color w:val="1F497D"/>
+              </w:rPr>
+              <w:t>Fotográfico</w:t>
+            </w:r>
+            <w:proofErr w:type="spellEnd"/>
           </w:p>
         </w:tc>
       </w:tr>

</xml_diff>